<commit_message>
Organize evidence by sample project in every control folder
- Each control's Evidence folder now mirrors the received package: one
  sub-folder per sample (Sample 1 ALCO - Security Lending, Sample 2 Derivatives
  NDF) plus 00 Common for the process map and population; checksum-verified
  that every received file sits in its project's sample folder
- C4: NDF copy of the environment evidence filed as C4.08 for Sample 2
- Evidence Index paths, Testing Procedures evidence lists and all packages rebuilt

Co-Authored-By: Claude Opus 5.5 <noreply@anthropic.com>
Claude-Session: https://claude.ai/code/session_01RkbhuE8rWvfJG8fUAag8f1
</commit_message>
<xml_diff>
--- a/SDLC 2026 - BSI Control Testing/BSI.IT.23.C4 Segregated Environments/BSI.IT.23.C4_SDLC_Design_WT_Sample_of_1_NDF_3264.docx
+++ b/SDLC 2026 - BSI Control Testing/BSI.IT.23.C4 Segregated Environments/BSI.IT.23.C4_SDLC_Design_WT_Sample_of_1_NDF_3264.docx
@@ -813,7 +813,7 @@
                 <w:i w:val="0"/>
                 <w:sz w:val="17"/>
               </w:rPr>
-              <w:t>DNS / server / environment records and T24 data per environment (C4.03); release tickets (C4.04 – C4.07).</w:t>
+              <w:t>DNS / server / environment records and T24 data per environment (C4.03 / C4.08); release tickets (C4.04 – C4.07).</w:t>
             </w:r>
           </w:p>
         </w:tc>
@@ -1321,7 +1321,7 @@
                 <w:i w:val="0"/>
                 <w:sz w:val="17"/>
               </w:rPr>
-              <w:t>C4.03</w:t>
+              <w:t>C4.03 / C4.08</w:t>
             </w:r>
           </w:p>
         </w:tc>
@@ -1400,7 +1400,7 @@
                 <w:i w:val="0"/>
                 <w:sz w:val="17"/>
               </w:rPr>
-              <w:t>C4.03</w:t>
+              <w:t>C4.03 / C4.08</w:t>
             </w:r>
           </w:p>
         </w:tc>
@@ -1479,7 +1479,7 @@
                 <w:i w:val="0"/>
                 <w:sz w:val="17"/>
               </w:rPr>
-              <w:t>C4.03 – C4.07</w:t>
+              <w:t>C4.03 – C4.08</w:t>
             </w:r>
           </w:p>
         </w:tc>
@@ -1558,7 +1558,7 @@
                 <w:i w:val="0"/>
                 <w:sz w:val="17"/>
               </w:rPr>
-              <w:t>C4.03</w:t>
+              <w:t>C4.03 / C4.08</w:t>
             </w:r>
           </w:p>
         </w:tc>
@@ -1637,7 +1637,7 @@
                 <w:i w:val="0"/>
                 <w:sz w:val="17"/>
               </w:rPr>
-              <w:t>C4.03</w:t>
+              <w:t>C4.03 / C4.08</w:t>
             </w:r>
           </w:p>
         </w:tc>
@@ -2659,7 +2659,7 @@
         <w:pStyle w:val="Heading1"/>
       </w:pPr>
       <w:r>
-        <w:t>Appendix A – Environment Evidence (BSI.IT.23.C4.03)</w:t>
+        <w:t>Appendix A – Environment Evidence (BSI.IT.23.C4.03 / C4.08)</w:t>
       </w:r>
     </w:p>
     <w:p>
@@ -2725,7 +2725,7 @@
           <w:color w:val="475569"/>
           <w:sz w:val="17"/>
         </w:rPr>
-        <w:t>Source: BSI.IT.23.C4.03 (images 1-3 production; 5-7 non-production). Same login ID MIASANG in both (OI-05).</w:t>
+        <w:t>Source: BSI.IT.23.C4.03 / C4.08 (images 1-3 production; 5-7 non-production). Same login ID MIASANG in both (OI-05).</w:t>
       </w:r>
     </w:p>
     <w:p>
@@ -2791,7 +2791,7 @@
           <w:color w:val="475569"/>
           <w:sz w:val="17"/>
         </w:rPr>
-        <w:t>Source: BSI.IT.23.C4.03 (image 4). "T24 Desktop – BANCO SANTANDER INTL." – live NDF deals 03/2026 – 07/2026.</w:t>
+        <w:t>Source: BSI.IT.23.C4.03 / C4.08 (image 4). "T24 Desktop – BANCO SANTANDER INTL." – live NDF deals 03/2026 – 07/2026.</w:t>
       </w:r>
     </w:p>
     <w:p>
@@ -2857,7 +2857,7 @@
           <w:color w:val="475569"/>
           <w:sz w:val="17"/>
         </w:rPr>
-        <w:t>Source: BSI.IT.23.C4.03 (image 8). "MIAAFT28 ON MIASX4 – SANTANDER OCT 2025 EOM" – test deals dated 11/2025.</w:t>
+        <w:t>Source: BSI.IT.23.C4.03 / C4.08 (image 8). "MIAAFT28 ON MIASX4 – SANTANDER OCT 2025 EOM" – test deals dated 11/2025.</w:t>
       </w:r>
     </w:p>
     <w:p>

</xml_diff>